<commit_message>
Adding first penguin, figuring out layout
</commit_message>
<xml_diff>
--- a/docs/SDDDocument-SP26-JBassett_0617.docx
+++ b/docs/SDDDocument-SP26-JBassett_0617.docx
@@ -25490,7 +25490,7 @@
           <w:noProof/>
         </w:rPr>
         <w:drawing>
-          <wp:inline distT="0" distB="0" distL="0" distR="0" wp14:anchorId="2CAF85B6" wp14:editId="6C9D6DBA">
+          <wp:inline distT="0" distB="0" distL="0" distR="0" wp14:anchorId="2CAF85B6" wp14:editId="1061B69D">
             <wp:extent cx="3060700" cy="3060700"/>
             <wp:effectExtent l="0" t="0" r="6350" b="6350"/>
             <wp:docPr id="1886745205" name="Picture 1"/>
@@ -25608,6 +25608,10 @@
       <w:pPr>
         <w:spacing w:line="0" w:lineRule="atLeast"/>
         <w:ind w:left="720" w:hanging="720"/>
+        <w:rPr>
+          <w:b/>
+          <w:bCs/>
+        </w:rPr>
       </w:pPr>
       <w:r>
         <w:t xml:space="preserve">Columbia Basin College. (n.d.). </w:t>
@@ -25630,6 +25634,16 @@
           <w:t>https://ccit.college.columbia.edu/knowledgebase/article/columbia-web-color-guide</w:t>
         </w:r>
       </w:hyperlink>
+      <w:r>
+        <w:br/>
+      </w:r>
+      <w:r>
+        <w:rPr>
+          <w:b/>
+          <w:bCs/>
+        </w:rPr>
+        <w:t>https://intranet.columbiabasin.edu/_documents/handbooks-guides-reports/brand-guide-4-20.pdf</w:t>
+      </w:r>
     </w:p>
     <w:p>
       <w:pPr>

</xml_diff>